<commit_message>
constancia generada ya con datos en mysql y restricciones
</commit_message>
<xml_diff>
--- a/api/src/recursos/plantilla_constancia/Constancia_Liberacion_Adeudos.docx
+++ b/api/src/recursos/plantilla_constancia/Constancia_Liberacion_Adeudos.docx
@@ -97,7 +97,10 @@
         <w:t>Por medio de la presente se hace constar</w:t>
       </w:r>
       <w:r>
-        <w:t xml:space="preserve"> que </w:t>
+        <w:t xml:space="preserve"> que</w:t>
+      </w:r>
+      <w:r>
+        <w:t xml:space="preserve"> </w:t>
       </w:r>
       <w:r>
         <w:rPr>
@@ -266,20 +269,23 @@
         <w:t xml:space="preserve">se encuentra liberado(a) de adeudos </w:t>
       </w:r>
       <w:r>
-        <w:t>y puede continuar con el proceso administrativo correspondiente a su egreso.</w:t>
-      </w:r>
-    </w:p>
-    <w:p>
-      <w:pPr>
-        <w:spacing w:line="276" w:lineRule="auto"/>
-      </w:pPr>
-    </w:p>
-    <w:p>
-      <w:pPr>
-        <w:spacing w:line="276" w:lineRule="auto"/>
-      </w:pPr>
-      <w:r>
-        <w:t>Se extiende la presente constancia a petición del interesado(a), para los fines académicos y administrativos que correspondan.</w:t>
+        <w:t>ante este departamento.</w:t>
+      </w:r>
+    </w:p>
+    <w:p>
+      <w:pPr>
+        <w:spacing w:line="276" w:lineRule="auto"/>
+      </w:pPr>
+    </w:p>
+    <w:p>
+      <w:pPr>
+        <w:spacing w:line="276" w:lineRule="auto"/>
+      </w:pPr>
+      <w:r>
+        <w:t>La presente constancia se expide exclusivamente para fines administrativos y académicos dentro del Instituto Tecnológico Superior de Lerdo, y será válida únicamente para los trámites que correspondan ante la ins</w:t>
+      </w:r>
+      <w:r>
+        <w:t>titución.</w:t>
       </w:r>
     </w:p>
     <w:p>

</xml_diff>